<commit_message>
Etiquetas basicas de diseño
</commit_message>
<xml_diff>
--- a/Documentacion HTML.docx
+++ b/Documentacion HTML.docx
@@ -12,22 +12,61 @@
     </w:p>
     <w:p>
       <w:r>
+        <w:rPr>
+          <w:highlight w:val="yellow"/>
+        </w:rPr>
         <w:t>14/03/2026</w:t>
       </w:r>
     </w:p>
     <w:p>
+      <w:proofErr w:type="gramStart"/>
       <w:r>
         <w:t>Que es HTML?</w:t>
       </w:r>
-    </w:p>
-    <w:p>
-      <w:r>
-        <w:t>Hyper Text Markup Language</w:t>
-      </w:r>
-    </w:p>
-    <w:p>
-      <w:r>
-        <w:t>Describe el esqueleto de las paginas web, que y como mostrarlo, es un lenfuage de etiquetas</w:t>
+      <w:proofErr w:type="gramEnd"/>
+    </w:p>
+    <w:p>
+      <w:proofErr w:type="spellStart"/>
+      <w:r>
+        <w:t>Hyper</w:t>
+      </w:r>
+      <w:proofErr w:type="spellEnd"/>
+      <w:r>
+        <w:t xml:space="preserve"> Text </w:t>
+      </w:r>
+      <w:proofErr w:type="spellStart"/>
+      <w:r>
+        <w:t>Markup</w:t>
+      </w:r>
+      <w:proofErr w:type="spellEnd"/>
+      <w:r>
+        <w:t xml:space="preserve"> </w:t>
+      </w:r>
+      <w:proofErr w:type="spellStart"/>
+      <w:r>
+        <w:t>Language</w:t>
+      </w:r>
+      <w:proofErr w:type="spellEnd"/>
+    </w:p>
+    <w:p>
+      <w:r>
+        <w:t xml:space="preserve">Describe el esqueleto de las </w:t>
+      </w:r>
+      <w:proofErr w:type="spellStart"/>
+      <w:r>
+        <w:t>paginas</w:t>
+      </w:r>
+      <w:proofErr w:type="spellEnd"/>
+      <w:r>
+        <w:t xml:space="preserve"> web, que y como mostrarlo, es un </w:t>
+      </w:r>
+      <w:proofErr w:type="spellStart"/>
+      <w:r>
+        <w:t>lenfuage</w:t>
+      </w:r>
+      <w:proofErr w:type="spellEnd"/>
+      <w:r>
+        <w:t xml:space="preserve"> de etiquetas</w:t>
       </w:r>
     </w:p>
     <w:p>
@@ -37,13 +76,29 @@
     </w:p>
     <w:p>
       <w:r>
-        <w:t>&lt;html&gt;</w:t>
+        <w:t>&lt;</w:t>
+      </w:r>
+      <w:proofErr w:type="spellStart"/>
+      <w:r>
+        <w:t>html</w:t>
+      </w:r>
+      <w:proofErr w:type="spellEnd"/>
+      <w:r>
+        <w:t>&gt;</w:t>
       </w:r>
     </w:p>
     <w:p>
       <w:r>
         <w:tab/>
-        <w:t>&lt;header&gt;</w:t>
+        <w:t>&lt;</w:t>
+      </w:r>
+      <w:proofErr w:type="spellStart"/>
+      <w:r>
+        <w:t>header</w:t>
+      </w:r>
+      <w:proofErr w:type="spellEnd"/>
+      <w:r>
+        <w:t>&gt;</w:t>
       </w:r>
     </w:p>
     <w:p>
@@ -52,75 +107,200 @@
       </w:pPr>
       <w:r>
         <w:tab/>
-        <w:t>&lt;title&gt;Titulo de la pagina&lt;/title&gt;</w:t>
+        <w:t>&lt;</w:t>
+      </w:r>
+      <w:proofErr w:type="spellStart"/>
+      <w:r>
+        <w:t>title</w:t>
+      </w:r>
+      <w:proofErr w:type="spellEnd"/>
+      <w:r>
+        <w:t xml:space="preserve">&gt;Titulo de la </w:t>
+      </w:r>
+      <w:proofErr w:type="spellStart"/>
+      <w:r>
+        <w:t>pagina</w:t>
+      </w:r>
+      <w:proofErr w:type="spellEnd"/>
+      <w:r>
+        <w:t>&lt;/</w:t>
+      </w:r>
+      <w:proofErr w:type="spellStart"/>
+      <w:r>
+        <w:t>title</w:t>
+      </w:r>
+      <w:proofErr w:type="spellEnd"/>
+      <w:r>
+        <w:t>&gt;</w:t>
       </w:r>
     </w:p>
     <w:p>
       <w:pPr>
         <w:ind w:firstLine="708"/>
+        <w:rPr>
+          <w:lang w:val="en-US"/>
+        </w:rPr>
       </w:pPr>
       <w:r>
+        <w:rPr>
+          <w:lang w:val="en-US"/>
+        </w:rPr>
         <w:t>&lt;/header&gt;</w:t>
       </w:r>
     </w:p>
     <w:p>
-      <w:r>
+      <w:pPr>
+        <w:rPr>
+          <w:lang w:val="en-US"/>
+        </w:rPr>
+      </w:pPr>
+      <w:r>
+        <w:rPr>
+          <w:lang w:val="en-US"/>
+        </w:rPr>
         <w:tab/>
         <w:t>&lt;body&gt;</w:t>
       </w:r>
     </w:p>
     <w:p>
-      <w:r>
+      <w:pPr>
+        <w:rPr>
+          <w:lang w:val="en-US"/>
+        </w:rPr>
+      </w:pPr>
+      <w:r>
+        <w:rPr>
+          <w:lang w:val="en-US"/>
+        </w:rPr>
         <w:tab/>
       </w:r>
       <w:r>
+        <w:rPr>
+          <w:lang w:val="en-US"/>
+        </w:rPr>
         <w:tab/>
         <w:t>&lt;section&gt;</w:t>
       </w:r>
     </w:p>
     <w:p>
-      <w:r>
+      <w:pPr>
+        <w:rPr>
+          <w:lang w:val="en-US"/>
+        </w:rPr>
+      </w:pPr>
+      <w:r>
+        <w:rPr>
+          <w:lang w:val="en-US"/>
+        </w:rPr>
         <w:tab/>
       </w:r>
       <w:r>
+        <w:rPr>
+          <w:lang w:val="en-US"/>
+        </w:rPr>
         <w:tab/>
       </w:r>
       <w:r>
+        <w:rPr>
+          <w:lang w:val="en-US"/>
+        </w:rPr>
         <w:tab/>
-        <w:t>&lt;h1&gt;Titulo principal&lt;/h1&gt;</w:t>
-      </w:r>
-    </w:p>
-    <w:p>
-      <w:r>
+        <w:t>&lt;h1&gt;</w:t>
+      </w:r>
+      <w:proofErr w:type="spellStart"/>
+      <w:r>
+        <w:rPr>
+          <w:lang w:val="en-US"/>
+        </w:rPr>
+        <w:t>Titulo</w:t>
+      </w:r>
+      <w:proofErr w:type="spellEnd"/>
+      <w:r>
+        <w:rPr>
+          <w:lang w:val="en-US"/>
+        </w:rPr>
+        <w:t xml:space="preserve"> principal&lt;/h1&gt;</w:t>
+      </w:r>
+    </w:p>
+    <w:p>
+      <w:pPr>
+        <w:rPr>
+          <w:lang w:val="en-US"/>
+        </w:rPr>
+      </w:pPr>
+      <w:r>
+        <w:rPr>
+          <w:lang w:val="en-US"/>
+        </w:rPr>
         <w:tab/>
       </w:r>
       <w:r>
+        <w:rPr>
+          <w:lang w:val="en-US"/>
+        </w:rPr>
         <w:tab/>
       </w:r>
       <w:r>
+        <w:rPr>
+          <w:lang w:val="en-US"/>
+        </w:rPr>
         <w:tab/>
-        <w:t>&lt;p&gt;Parrafo&lt;/p&gt;</w:t>
+        <w:t>&lt;p&gt;</w:t>
+      </w:r>
+      <w:proofErr w:type="spellStart"/>
+      <w:r>
+        <w:rPr>
+          <w:lang w:val="en-US"/>
+        </w:rPr>
+        <w:t>Parrafo</w:t>
+      </w:r>
+      <w:proofErr w:type="spellEnd"/>
+      <w:r>
+        <w:rPr>
+          <w:lang w:val="en-US"/>
+        </w:rPr>
+        <w:t>&lt;/p&gt;</w:t>
       </w:r>
     </w:p>
     <w:p>
       <w:pPr>
         <w:ind w:left="708" w:firstLine="708"/>
+        <w:rPr>
+          <w:lang w:val="en-US"/>
+        </w:rPr>
       </w:pPr>
       <w:r>
+        <w:rPr>
+          <w:lang w:val="en-US"/>
+        </w:rPr>
         <w:t>&lt;/section&gt;</w:t>
       </w:r>
     </w:p>
     <w:p>
       <w:pPr>
         <w:ind w:firstLine="708"/>
+        <w:rPr>
+          <w:lang w:val="en-US"/>
+        </w:rPr>
       </w:pPr>
       <w:r>
+        <w:rPr>
+          <w:lang w:val="en-US"/>
+        </w:rPr>
         <w:t>&lt;/body&gt;</w:t>
       </w:r>
     </w:p>
     <w:p>
       <w:r>
-        <w:t>&lt;/html&gt;</w:t>
+        <w:t>&lt;/</w:t>
+      </w:r>
+      <w:proofErr w:type="spellStart"/>
+      <w:r>
+        <w:t>html</w:t>
+      </w:r>
+      <w:proofErr w:type="spellEnd"/>
+      <w:r>
+        <w:t>&gt;</w:t>
       </w:r>
     </w:p>
     <w:p/>
@@ -133,9 +313,11 @@
       </w:r>
     </w:p>
     <w:p>
+      <w:proofErr w:type="gramStart"/>
       <w:r>
         <w:t>¡ TAB</w:t>
       </w:r>
+      <w:proofErr w:type="gramEnd"/>
     </w:p>
     <w:p>
       <w:r>
@@ -143,8 +325,13 @@
       </w:r>
     </w:p>
     <w:p>
-      <w:r>
-        <w:t xml:space="preserve">Doctype </w:t>
+      <w:proofErr w:type="spellStart"/>
+      <w:r>
+        <w:t>Doctype</w:t>
+      </w:r>
+      <w:proofErr w:type="spellEnd"/>
+      <w:r>
+        <w:t xml:space="preserve"> </w:t>
       </w:r>
       <w:r>
         <w:sym w:font="Wingdings" w:char="F0E0"/>
@@ -154,15 +341,25 @@
       </w:r>
     </w:p>
     <w:p>
-      <w:r>
-        <w:t xml:space="preserve">Html </w:t>
+      <w:proofErr w:type="spellStart"/>
+      <w:r>
+        <w:t>Html</w:t>
+      </w:r>
+      <w:proofErr w:type="spellEnd"/>
+      <w:r>
+        <w:t xml:space="preserve"> </w:t>
       </w:r>
       <w:r>
         <w:sym w:font="Wingdings" w:char="F0E0"/>
       </w:r>
       <w:r>
-        <w:t xml:space="preserve"> etiqueta raíz de todo html</w:t>
-      </w:r>
+        <w:t xml:space="preserve"> etiqueta raíz de todo </w:t>
+      </w:r>
+      <w:proofErr w:type="spellStart"/>
+      <w:r>
+        <w:t>html</w:t>
+      </w:r>
+      <w:proofErr w:type="spellEnd"/>
     </w:p>
     <w:p>
       <w:r>
@@ -172,7 +369,15 @@
         <w:sym w:font="Wingdings" w:char="F0E0"/>
       </w:r>
       <w:r>
-        <w:t xml:space="preserve"> características que va a tener la pagina, no necesariamente </w:t>
+        <w:t xml:space="preserve"> características que va a tener la </w:t>
+      </w:r>
+      <w:proofErr w:type="spellStart"/>
+      <w:r>
+        <w:t>pagina</w:t>
+      </w:r>
+      <w:proofErr w:type="spellEnd"/>
+      <w:r>
+        <w:t xml:space="preserve">, no necesariamente </w:t>
       </w:r>
       <w:r>
         <w:t>es visible</w:t>
@@ -187,6 +392,533 @@
       </w:r>
       <w:r>
         <w:t xml:space="preserve"> donde se coloca todo el cuerpo de la pagina</w:t>
+      </w:r>
+    </w:p>
+    <w:p>
+      <w:r>
+        <w:lastRenderedPageBreak/>
+        <w:t>15/03/2026</w:t>
+      </w:r>
+    </w:p>
+    <w:p>
+      <w:r>
+        <w:t xml:space="preserve">Title </w:t>
+      </w:r>
+      <w:r>
+        <w:sym w:font="Wingdings" w:char="F0E0"/>
+      </w:r>
+      <w:r>
+        <w:t xml:space="preserve"> etiqueta de </w:t>
+      </w:r>
+      <w:proofErr w:type="spellStart"/>
+      <w:r>
+        <w:t>titulo</w:t>
+      </w:r>
+      <w:proofErr w:type="spellEnd"/>
+      <w:r>
+        <w:t xml:space="preserve"> en la pantalla</w:t>
+      </w:r>
+    </w:p>
+    <w:p>
+      <w:r>
+        <w:t xml:space="preserve">Dentro de </w:t>
+      </w:r>
+      <w:proofErr w:type="spellStart"/>
+      <w:r>
+        <w:t>body</w:t>
+      </w:r>
+      <w:proofErr w:type="spellEnd"/>
+      <w:r>
+        <w:t>:</w:t>
+      </w:r>
+    </w:p>
+    <w:p>
+      <w:r>
+        <w:t>&lt;h1&gt; Volviendo a HTML &lt;/h1&gt; Titulo principal</w:t>
+      </w:r>
+    </w:p>
+    <w:p>
+      <w:r>
+        <w:t>&lt;h2&gt; &lt;/h2&gt; para segundo titulo</w:t>
+      </w:r>
+    </w:p>
+    <w:p>
+      <w:r>
+        <w:t>&lt;h3</w:t>
+      </w:r>
+      <w:proofErr w:type="gramStart"/>
+      <w:r>
+        <w:t>&gt;  &lt;</w:t>
+      </w:r>
+      <w:proofErr w:type="gramEnd"/>
+      <w:r>
+        <w:t>/h3&gt; para tercer título y así sucesivamente ….</w:t>
+      </w:r>
+      <w:r>
+        <w:t xml:space="preserve"> Hasta &lt;h6</w:t>
+      </w:r>
+      <w:r>
+        <w:rPr>
+          <w:sz w:val="22"/>
+          <w:szCs w:val="22"/>
+        </w:rPr>
+        <w:t>&gt; &lt;/h6&gt;</w:t>
+      </w:r>
+      <w:r>
+        <w:t xml:space="preserve"> </w:t>
+      </w:r>
+    </w:p>
+    <w:p>
+      <w:r>
+        <w:t>Para indicar cabeceras o subcabeceras</w:t>
+      </w:r>
+    </w:p>
+    <w:p/>
+    <w:p>
+      <w:r>
+        <w:t>&lt;p&gt; &lt;/p&gt; etiqueta de párrafo para escribir lo que sea</w:t>
+      </w:r>
+    </w:p>
+    <w:p>
+      <w:r>
+        <w:t>&lt;</w:t>
+      </w:r>
+      <w:proofErr w:type="spellStart"/>
+      <w:r>
+        <w:t>hr</w:t>
+      </w:r>
+      <w:proofErr w:type="spellEnd"/>
+      <w:r>
+        <w:t>&gt; para separar el texto y que quede tipo secciones</w:t>
+      </w:r>
+    </w:p>
+    <w:p>
+      <w:proofErr w:type="gramStart"/>
+      <w:r>
+        <w:t>&lt;!—</w:t>
+      </w:r>
+      <w:proofErr w:type="gramEnd"/>
+      <w:r>
+        <w:t>para comentarios --</w:t>
+      </w:r>
+      <w:proofErr w:type="gramStart"/>
+      <w:r>
+        <w:t>&gt;  comentarios</w:t>
+      </w:r>
+      <w:proofErr w:type="gramEnd"/>
+    </w:p>
+    <w:p>
+      <w:pPr>
+        <w:rPr>
+          <w:sz w:val="22"/>
+          <w:szCs w:val="22"/>
+        </w:rPr>
+      </w:pPr>
+    </w:p>
+    <w:p>
+      <w:r>
+        <w:t xml:space="preserve">&lt;p&gt; </w:t>
+      </w:r>
+      <w:r>
+        <w:t>Este texto es &lt;</w:t>
+      </w:r>
+      <w:proofErr w:type="spellStart"/>
+      <w:r>
+        <w:t>span</w:t>
+      </w:r>
+      <w:proofErr w:type="spellEnd"/>
+      <w:r>
+        <w:t xml:space="preserve"> </w:t>
+      </w:r>
+      <w:proofErr w:type="spellStart"/>
+      <w:r>
+        <w:t>style</w:t>
+      </w:r>
+      <w:proofErr w:type="spellEnd"/>
+      <w:r>
+        <w:t xml:space="preserve"> = “</w:t>
+      </w:r>
+      <w:proofErr w:type="spellStart"/>
+      <w:proofErr w:type="gramStart"/>
+      <w:r>
+        <w:t>color:blue</w:t>
+      </w:r>
+      <w:proofErr w:type="spellEnd"/>
+      <w:proofErr w:type="gramEnd"/>
+      <w:r>
+        <w:t>”</w:t>
+      </w:r>
+      <w:r>
+        <w:t xml:space="preserve">&gt; mucho </w:t>
+      </w:r>
+      <w:proofErr w:type="spellStart"/>
+      <w:r>
+        <w:t>mas</w:t>
+      </w:r>
+      <w:proofErr w:type="spellEnd"/>
+      <w:r>
+        <w:t xml:space="preserve"> largo &lt;/</w:t>
+      </w:r>
+      <w:proofErr w:type="spellStart"/>
+      <w:r>
+        <w:t>span</w:t>
+      </w:r>
+      <w:proofErr w:type="spellEnd"/>
+      <w:r>
+        <w:t xml:space="preserve">&gt; y es para la etiqueta de </w:t>
+      </w:r>
+      <w:proofErr w:type="spellStart"/>
+      <w:r>
+        <w:t>span</w:t>
+      </w:r>
+      <w:proofErr w:type="spellEnd"/>
+      <w:r>
+        <w:t>&lt;/p&gt;</w:t>
+      </w:r>
+    </w:p>
+    <w:p>
+      <w:r>
+        <w:t>Span sirve para referenciar el texto seleccionado</w:t>
+      </w:r>
+    </w:p>
+    <w:p/>
+    <w:p>
+      <w:r>
+        <w:t>&lt;p&gt; Este texto es &lt;</w:t>
+      </w:r>
+      <w:proofErr w:type="spellStart"/>
+      <w:r>
+        <w:t>span</w:t>
+      </w:r>
+      <w:proofErr w:type="spellEnd"/>
+      <w:r>
+        <w:t xml:space="preserve"> </w:t>
+      </w:r>
+      <w:proofErr w:type="spellStart"/>
+      <w:r>
+        <w:t>style</w:t>
+      </w:r>
+      <w:proofErr w:type="spellEnd"/>
+      <w:r>
+        <w:t xml:space="preserve"> = “</w:t>
+      </w:r>
+      <w:proofErr w:type="spellStart"/>
+      <w:proofErr w:type="gramStart"/>
+      <w:r>
+        <w:t>color:blue</w:t>
+      </w:r>
+      <w:proofErr w:type="spellEnd"/>
+      <w:proofErr w:type="gramEnd"/>
+      <w:r>
+        <w:t xml:space="preserve">”&gt; mucho </w:t>
+      </w:r>
+      <w:proofErr w:type="spellStart"/>
+      <w:r>
+        <w:t>mas</w:t>
+      </w:r>
+      <w:proofErr w:type="spellEnd"/>
+      <w:r>
+        <w:t xml:space="preserve"> largo &lt;/</w:t>
+      </w:r>
+      <w:proofErr w:type="spellStart"/>
+      <w:r>
+        <w:t>span</w:t>
+      </w:r>
+      <w:proofErr w:type="spellEnd"/>
+      <w:r>
+        <w:t xml:space="preserve">&gt; </w:t>
+      </w:r>
+    </w:p>
+    <w:p>
+      <w:r>
+        <w:t>y es para</w:t>
+      </w:r>
+      <w:r>
+        <w:t xml:space="preserve"> mostrar</w:t>
+      </w:r>
+      <w:r>
+        <w:t xml:space="preserve"> </w:t>
+      </w:r>
+      <w:r>
+        <w:t>&lt;</w:t>
+      </w:r>
+      <w:proofErr w:type="spellStart"/>
+      <w:r>
+        <w:t>br</w:t>
+      </w:r>
+      <w:proofErr w:type="spellEnd"/>
+      <w:r>
+        <w:t xml:space="preserve">&gt; </w:t>
+      </w:r>
+      <w:r>
+        <w:rPr>
+          <w:highlight w:val="yellow"/>
+        </w:rPr>
+        <w:t>SALTO DE LINEA</w:t>
+      </w:r>
+    </w:p>
+    <w:p>
+      <w:r>
+        <w:t xml:space="preserve">la etiqueta de </w:t>
+      </w:r>
+      <w:proofErr w:type="spellStart"/>
+      <w:r>
+        <w:t>span</w:t>
+      </w:r>
+      <w:proofErr w:type="spellEnd"/>
+      <w:r>
+        <w:t>&lt;/p&gt;</w:t>
+      </w:r>
+    </w:p>
+    <w:p>
+      <w:pPr>
+        <w:rPr>
+          <w:sz w:val="22"/>
+          <w:szCs w:val="22"/>
+        </w:rPr>
+      </w:pPr>
+    </w:p>
+    <w:p>
+      <w:proofErr w:type="spellStart"/>
+      <w:r>
+        <w:t>Hipervinculo</w:t>
+      </w:r>
+      <w:proofErr w:type="spellEnd"/>
+    </w:p>
+    <w:p>
+      <w:r>
+        <w:t xml:space="preserve">&lt;a </w:t>
+      </w:r>
+      <w:proofErr w:type="spellStart"/>
+      <w:r>
+        <w:t>href</w:t>
+      </w:r>
+      <w:proofErr w:type="spellEnd"/>
+      <w:r>
+        <w:t xml:space="preserve"> = “https://www.google.com”&gt; Ir a </w:t>
+      </w:r>
+      <w:proofErr w:type="spellStart"/>
+      <w:r>
+        <w:t>google</w:t>
+      </w:r>
+      <w:proofErr w:type="spellEnd"/>
+      <w:r>
+        <w:t xml:space="preserve"> &lt;/a&gt; en la misma pestaña</w:t>
+      </w:r>
+    </w:p>
+    <w:p>
+      <w:r>
+        <w:t xml:space="preserve">&lt;a </w:t>
+      </w:r>
+      <w:proofErr w:type="gramStart"/>
+      <w:r>
+        <w:t>target</w:t>
+      </w:r>
+      <w:proofErr w:type="gramEnd"/>
+      <w:r>
+        <w:t xml:space="preserve"> = “_</w:t>
+      </w:r>
+      <w:proofErr w:type="spellStart"/>
+      <w:r>
+        <w:t>blank</w:t>
+      </w:r>
+      <w:proofErr w:type="spellEnd"/>
+      <w:r>
+        <w:t xml:space="preserve">” </w:t>
+      </w:r>
+      <w:proofErr w:type="spellStart"/>
+      <w:r>
+        <w:t>href</w:t>
+      </w:r>
+      <w:proofErr w:type="spellEnd"/>
+      <w:r>
+        <w:t xml:space="preserve"> = “https://www.google.com”</w:t>
+      </w:r>
+      <w:r>
+        <w:t xml:space="preserve"> &gt; Ir a </w:t>
+      </w:r>
+      <w:proofErr w:type="spellStart"/>
+      <w:r>
+        <w:t>google</w:t>
+      </w:r>
+      <w:proofErr w:type="spellEnd"/>
+      <w:r>
+        <w:t xml:space="preserve"> &lt;/a&gt; otra pesta</w:t>
+      </w:r>
+      <w:r>
+        <w:t>ña</w:t>
+      </w:r>
+    </w:p>
+    <w:p/>
+    <w:p>
+      <w:r>
+        <w:t>Imágenes</w:t>
+      </w:r>
+    </w:p>
+    <w:p>
+      <w:r>
+        <w:t>&lt;</w:t>
+      </w:r>
+      <w:proofErr w:type="spellStart"/>
+      <w:r>
+        <w:t>img</w:t>
+      </w:r>
+      <w:proofErr w:type="spellEnd"/>
+      <w:r>
+        <w:t xml:space="preserve"> </w:t>
+      </w:r>
+      <w:proofErr w:type="spellStart"/>
+      <w:r>
+        <w:t>src</w:t>
+      </w:r>
+      <w:proofErr w:type="spellEnd"/>
+      <w:proofErr w:type="gramStart"/>
+      <w:r>
+        <w:t>=”RUTA</w:t>
+      </w:r>
+      <w:proofErr w:type="gramEnd"/>
+      <w:r>
+        <w:t xml:space="preserve"> URL </w:t>
+      </w:r>
+      <w:proofErr w:type="gramStart"/>
+      <w:r>
+        <w:t>/</w:t>
+      </w:r>
+      <w:r>
+        <w:t xml:space="preserve"> </w:t>
+      </w:r>
+      <w:r>
+        <w:t xml:space="preserve"> </w:t>
+      </w:r>
+      <w:r>
+        <w:t>IMG\imagen.png</w:t>
+      </w:r>
+      <w:proofErr w:type="gramEnd"/>
+      <w:r>
+        <w:t>”</w:t>
+      </w:r>
+      <w:r>
+        <w:t>/</w:t>
+      </w:r>
+      <w:r>
+        <w:t xml:space="preserve">&gt;  </w:t>
+      </w:r>
+    </w:p>
+    <w:p>
+      <w:pPr>
+        <w:rPr>
+          <w:lang w:val="en-US"/>
+        </w:rPr>
+      </w:pPr>
+      <w:proofErr w:type="spellStart"/>
+      <w:r>
+        <w:rPr>
+          <w:lang w:val="en-US"/>
+        </w:rPr>
+        <w:lastRenderedPageBreak/>
+        <w:t>Redimensionar</w:t>
+      </w:r>
+      <w:proofErr w:type="spellEnd"/>
+      <w:r>
+        <w:rPr>
+          <w:lang w:val="en-US"/>
+        </w:rPr>
+        <w:t xml:space="preserve"> imagen</w:t>
+      </w:r>
+    </w:p>
+    <w:p>
+      <w:pPr>
+        <w:rPr>
+          <w:lang w:val="en-US"/>
+        </w:rPr>
+      </w:pPr>
+      <w:r>
+        <w:rPr>
+          <w:lang w:val="en-US"/>
+        </w:rPr>
+        <w:t>&lt;</w:t>
+      </w:r>
+      <w:proofErr w:type="spellStart"/>
+      <w:r>
+        <w:rPr>
+          <w:lang w:val="en-US"/>
+        </w:rPr>
+        <w:t>img</w:t>
+      </w:r>
+      <w:proofErr w:type="spellEnd"/>
+      <w:r>
+        <w:rPr>
+          <w:lang w:val="en-US"/>
+        </w:rPr>
+        <w:t xml:space="preserve"> </w:t>
+      </w:r>
+      <w:proofErr w:type="spellStart"/>
+      <w:r>
+        <w:rPr>
+          <w:lang w:val="en-US"/>
+        </w:rPr>
+        <w:t>src</w:t>
+      </w:r>
+      <w:proofErr w:type="spellEnd"/>
+      <w:r>
+        <w:rPr>
+          <w:lang w:val="en-US"/>
+        </w:rPr>
+        <w:t xml:space="preserve"> = </w:t>
+      </w:r>
+      <w:proofErr w:type="gramStart"/>
+      <w:r>
+        <w:rPr>
+          <w:lang w:val="en-US"/>
+        </w:rPr>
+        <w:t>“”  width</w:t>
+      </w:r>
+      <w:proofErr w:type="gramEnd"/>
+      <w:r>
+        <w:rPr>
+          <w:lang w:val="en-US"/>
+        </w:rPr>
+        <w:t xml:space="preserve"> = “400 </w:t>
+      </w:r>
+      <w:proofErr w:type="spellStart"/>
+      <w:r>
+        <w:rPr>
+          <w:lang w:val="en-US"/>
+        </w:rPr>
+        <w:t>px</w:t>
+      </w:r>
+      <w:proofErr w:type="spellEnd"/>
+      <w:r>
+        <w:rPr>
+          <w:lang w:val="en-US"/>
+        </w:rPr>
+        <w:t xml:space="preserve">” height = “400 </w:t>
+      </w:r>
+      <w:proofErr w:type="spellStart"/>
+      <w:r>
+        <w:rPr>
+          <w:lang w:val="en-US"/>
+        </w:rPr>
+        <w:t>px</w:t>
+      </w:r>
+      <w:proofErr w:type="spellEnd"/>
+      <w:r>
+        <w:rPr>
+          <w:lang w:val="en-US"/>
+        </w:rPr>
+        <w:t>”</w:t>
+      </w:r>
+      <w:r>
+        <w:rPr>
+          <w:lang w:val="en-US"/>
+        </w:rPr>
+        <w:t>/</w:t>
+      </w:r>
+      <w:r>
+        <w:rPr>
+          <w:lang w:val="en-US"/>
+        </w:rPr>
+        <w:t xml:space="preserve">&gt; </w:t>
       </w:r>
     </w:p>
     <w:sectPr>
@@ -1116,6 +1848,29 @@
       <w:spacing w:val="5"/>
     </w:rPr>
   </w:style>
+  <w:style w:type="character" w:styleId="Hipervnculo">
+    <w:name w:val="Hyperlink"/>
+    <w:basedOn w:val="Fuentedeprrafopredeter"/>
+    <w:uiPriority w:val="99"/>
+    <w:unhideWhenUsed/>
+    <w:rsid w:val="00F21A35"/>
+    <w:rPr>
+      <w:color w:val="467886" w:themeColor="hyperlink"/>
+      <w:u w:val="single"/>
+    </w:rPr>
+  </w:style>
+  <w:style w:type="character" w:styleId="Mencinsinresolver">
+    <w:name w:val="Unresolved Mention"/>
+    <w:basedOn w:val="Fuentedeprrafopredeter"/>
+    <w:uiPriority w:val="99"/>
+    <w:semiHidden/>
+    <w:unhideWhenUsed/>
+    <w:rsid w:val="00F21A35"/>
+    <w:rPr>
+      <w:color w:val="605E5C"/>
+      <w:shd w:val="clear" w:color="auto" w:fill="E1DFDD"/>
+    </w:rPr>
+  </w:style>
 </w:styles>
 </file>
 

</xml_diff>